<commit_message>
DPRO-17 Refine task acceptance criteria and report assignees
</commit_message>
<xml_diff>
--- a/report.docx
+++ b/report.docx
@@ -2178,6 +2178,252 @@
         <w:t>Отчёт по исполнителям приведён ниже как срез задач из YouTrack. Он отражает количество назначенных карточек, а не индивидуальную трудоёмкость: несколько участников могут работать над одной задачей. Эпики исключены, чтобы не считать одну и ту же работу дважды.</w:t>
       </w:r>
     </w:p>
+    <w:tbl>
+      <w:tblPr>
+        <w:tblStyle w:val="TableGrid"/>
+        <w:tblW w:type="auto" w:w="0"/>
+        <w:tblLook w:firstColumn="1" w:firstRow="1" w:lastColumn="0" w:lastRow="0" w:noHBand="0" w:noVBand="1" w:val="04A0"/>
+      </w:tblPr>
+      <w:tblGrid>
+        <w:gridCol w:w="4958"/>
+        <w:gridCol w:w="4958"/>
+      </w:tblGrid>
+      <w:tr>
+        <w:tc>
+          <w:tcPr>
+            <w:tcW w:type="dxa" w:w="4958"/>
+          </w:tcPr>
+          <w:p>
+            <w:r>
+              <w:rPr>
+                <w:b/>
+              </w:rPr>
+              <w:t>Исполнитель</w:t>
+            </w:r>
+          </w:p>
+        </w:tc>
+        <w:tc>
+          <w:tcPr>
+            <w:tcW w:type="dxa" w:w="4958"/>
+          </w:tcPr>
+          <w:p>
+            <w:r>
+              <w:rPr>
+                <w:b/>
+              </w:rPr>
+              <w:t>Задач</w:t>
+            </w:r>
+          </w:p>
+        </w:tc>
+      </w:tr>
+      <w:tr>
+        <w:tc>
+          <w:tcPr>
+            <w:tcW w:type="dxa" w:w="4958"/>
+          </w:tcPr>
+          <w:p>
+            <w:r>
+              <w:t>dpro.qa</w:t>
+            </w:r>
+          </w:p>
+        </w:tc>
+        <w:tc>
+          <w:tcPr>
+            <w:tcW w:type="dxa" w:w="4958"/>
+          </w:tcPr>
+          <w:p>
+            <w:r>
+              <w:t>20</w:t>
+            </w:r>
+          </w:p>
+        </w:tc>
+      </w:tr>
+      <w:tr>
+        <w:tc>
+          <w:tcPr>
+            <w:tcW w:type="dxa" w:w="4958"/>
+          </w:tcPr>
+          <w:p>
+            <w:r>
+              <w:t>dpro.be1</w:t>
+            </w:r>
+          </w:p>
+        </w:tc>
+        <w:tc>
+          <w:tcPr>
+            <w:tcW w:type="dxa" w:w="4958"/>
+          </w:tcPr>
+          <w:p>
+            <w:r>
+              <w:t>19</w:t>
+            </w:r>
+          </w:p>
+        </w:tc>
+      </w:tr>
+      <w:tr>
+        <w:tc>
+          <w:tcPr>
+            <w:tcW w:type="dxa" w:w="4958"/>
+          </w:tcPr>
+          <w:p>
+            <w:r>
+              <w:t>dpro.be2</w:t>
+            </w:r>
+          </w:p>
+        </w:tc>
+        <w:tc>
+          <w:tcPr>
+            <w:tcW w:type="dxa" w:w="4958"/>
+          </w:tcPr>
+          <w:p>
+            <w:r>
+              <w:t>15</w:t>
+            </w:r>
+          </w:p>
+        </w:tc>
+      </w:tr>
+      <w:tr>
+        <w:tc>
+          <w:tcPr>
+            <w:tcW w:type="dxa" w:w="4958"/>
+          </w:tcPr>
+          <w:p>
+            <w:r>
+              <w:t>dpro.fe1</w:t>
+            </w:r>
+          </w:p>
+        </w:tc>
+        <w:tc>
+          <w:tcPr>
+            <w:tcW w:type="dxa" w:w="4958"/>
+          </w:tcPr>
+          <w:p>
+            <w:r>
+              <w:t>15</w:t>
+            </w:r>
+          </w:p>
+        </w:tc>
+      </w:tr>
+      <w:tr>
+        <w:tc>
+          <w:tcPr>
+            <w:tcW w:type="dxa" w:w="4958"/>
+          </w:tcPr>
+          <w:p>
+            <w:r>
+              <w:t>dpro.devops</w:t>
+            </w:r>
+          </w:p>
+        </w:tc>
+        <w:tc>
+          <w:tcPr>
+            <w:tcW w:type="dxa" w:w="4958"/>
+          </w:tcPr>
+          <w:p>
+            <w:r>
+              <w:t>14</w:t>
+            </w:r>
+          </w:p>
+        </w:tc>
+      </w:tr>
+      <w:tr>
+        <w:tc>
+          <w:tcPr>
+            <w:tcW w:type="dxa" w:w="4958"/>
+          </w:tcPr>
+          <w:p>
+            <w:r>
+              <w:t>dpro.fe2</w:t>
+            </w:r>
+          </w:p>
+        </w:tc>
+        <w:tc>
+          <w:tcPr>
+            <w:tcW w:type="dxa" w:w="4958"/>
+          </w:tcPr>
+          <w:p>
+            <w:r>
+              <w:t>13</w:t>
+            </w:r>
+          </w:p>
+        </w:tc>
+      </w:tr>
+      <w:tr>
+        <w:tc>
+          <w:tcPr>
+            <w:tcW w:type="dxa" w:w="4958"/>
+          </w:tcPr>
+          <w:p>
+            <w:r>
+              <w:t>dpro.pm</w:t>
+            </w:r>
+          </w:p>
+        </w:tc>
+        <w:tc>
+          <w:tcPr>
+            <w:tcW w:type="dxa" w:w="4958"/>
+          </w:tcPr>
+          <w:p>
+            <w:r>
+              <w:t>10</w:t>
+            </w:r>
+          </w:p>
+        </w:tc>
+      </w:tr>
+      <w:tr>
+        <w:tc>
+          <w:tcPr>
+            <w:tcW w:type="dxa" w:w="4958"/>
+          </w:tcPr>
+          <w:p>
+            <w:r>
+              <w:t>dpro.ux</w:t>
+            </w:r>
+          </w:p>
+        </w:tc>
+        <w:tc>
+          <w:tcPr>
+            <w:tcW w:type="dxa" w:w="4958"/>
+          </w:tcPr>
+          <w:p>
+            <w:r>
+              <w:t>7</w:t>
+            </w:r>
+          </w:p>
+        </w:tc>
+      </w:tr>
+      <w:tr>
+        <w:tc>
+          <w:tcPr>
+            <w:tcW w:type="dxa" w:w="4958"/>
+          </w:tcPr>
+          <w:p>
+            <w:r>
+              <w:t>Всего</w:t>
+            </w:r>
+          </w:p>
+        </w:tc>
+        <w:tc>
+          <w:tcPr>
+            <w:tcW w:type="dxa" w:w="4958"/>
+          </w:tcPr>
+          <w:p>
+            <w:r>
+              <w:t>113</w:t>
+            </w:r>
+          </w:p>
+        </w:tc>
+      </w:tr>
+    </w:tbl>
+    <w:p/>
+    <w:p>
+      <w:pPr>
+        <w:spacing w:after="120"/>
+      </w:pPr>
+      <w:r>
+        <w:t>В срез включены 111 продуктовых задач и две задачи по настройке проекта. Диаграмма построена по данным карточек YouTrack; остальные три отчёта сохранены во встроенном разделе Reports.</w:t>
+      </w:r>
+    </w:p>
     <w:p>
       <w:r>
         <w:drawing>
@@ -2391,7 +2637,15 @@
         <w:spacing w:after="120"/>
       </w:pPr>
       <w:r>
-        <w:t>Проверены создание проекта, доски, 16 спринтов, 3 релизных версий, состав команды, связи задач с эпиками и привязка к спринтам. Проверка связи git-коммита с карточкой должна опираться на запись VCS в YouTrack после синхронизации репозитория. Статистика на дату среза характеризует начало проекта, а не его завершение; итоговые отчёты нужно переснять после S16.</w:t>
+        <w:t>Проверены создание проекта, доски, 16 спринтов, 3 релизных версий, состав команды, связи задач с эпиками и привязка к спринтам. В GitHub опубликованы ветви main, develop, feature/DPRO-21-domain-model, feature/DPRO-22-api-design, feature/DPRO-24-infrastructure, feature/DPRO-28-design-system и feature/DPRO-29-responsive-layout. Остальные рабочие ветви создаются при взятии задач в спринт; релизные ветви — при подготовке соответствующей версии.</w:t>
+      </w:r>
+    </w:p>
+    <w:p>
+      <w:pPr>
+        <w:spacing w:after="120"/>
+      </w:pPr>
+      <w:r>
+        <w:t>Связь GitHub с YouTrack подтверждена: коммит a229d7d с ключом DPRO-17 появился в разделе VCS карточки DPRO-17. Статистика на дату среза характеризует начало проекта, а не его завершение; итоговые отчёты нужно переснять после S16.</w:t>
       </w:r>
     </w:p>
     <w:p>

</xml_diff>

<commit_message>
DPRO-17 Add native YouTrack screenshots to project report
</commit_message>
<xml_diff>
--- a/report.docx
+++ b/report.docx
@@ -88,6 +88,50 @@
       </w:pPr>
       <w:r>
         <w:t>В YouTrack создан проект Dprofile MVP (DPRO). В проектную команду добавлены восемь учётных записей разных специализаций. Созданные адреса используют домен example.invalid; перед началом совместной работы их нужно заменить действительными почтовыми адресами участников. Пароли хранятся вне репозитория в локальном файле ~/.codex/dprofile-team-credentials.json с правами 0600.</w:t>
+      </w:r>
+    </w:p>
+    <w:p>
+      <w:r>
+        <w:drawing>
+          <wp:inline xmlns:a="http://schemas.openxmlformats.org/drawingml/2006/main" xmlns:pic="http://schemas.openxmlformats.org/drawingml/2006/picture">
+            <wp:extent cx="5580000" cy="771055"/>
+            <wp:docPr id="1" name="Picture 1"/>
+            <wp:cNvGraphicFramePr>
+              <a:graphicFrameLocks noChangeAspect="1"/>
+            </wp:cNvGraphicFramePr>
+            <a:graphic>
+              <a:graphicData uri="http://schemas.openxmlformats.org/drawingml/2006/picture">
+                <pic:pic>
+                  <pic:nvPicPr>
+                    <pic:cNvPr id="0" name="youtrack-project.png"/>
+                    <pic:cNvPicPr/>
+                  </pic:nvPicPr>
+                  <pic:blipFill>
+                    <a:blip r:embed="rId9"/>
+                    <a:stretch>
+                      <a:fillRect/>
+                    </a:stretch>
+                  </pic:blipFill>
+                  <pic:spPr>
+                    <a:xfrm>
+                      <a:off x="0" y="0"/>
+                      <a:ext cx="5580000" cy="771055"/>
+                    </a:xfrm>
+                    <a:prstGeom prst="rect"/>
+                  </pic:spPr>
+                </pic:pic>
+              </a:graphicData>
+            </a:graphic>
+          </wp:inline>
+        </w:drawing>
+      </w:r>
+    </w:p>
+    <w:p>
+      <w:pPr>
+        <w:pStyle w:val="Caption"/>
+      </w:pPr>
+      <w:r>
+        <w:t>Страница проекта Dprofile MVP в YouTrack</w:t>
       </w:r>
     </w:p>
     <w:tbl>
@@ -1465,6 +1509,50 @@
       </w:r>
     </w:p>
     <w:p>
+      <w:r>
+        <w:drawing>
+          <wp:inline xmlns:a="http://schemas.openxmlformats.org/drawingml/2006/main" xmlns:pic="http://schemas.openxmlformats.org/drawingml/2006/picture">
+            <wp:extent cx="5580000" cy="3487500"/>
+            <wp:docPr id="2" name="Picture 2"/>
+            <wp:cNvGraphicFramePr>
+              <a:graphicFrameLocks noChangeAspect="1"/>
+            </wp:cNvGraphicFramePr>
+            <a:graphic>
+              <a:graphicData uri="http://schemas.openxmlformats.org/drawingml/2006/picture">
+                <pic:pic>
+                  <pic:nvPicPr>
+                    <pic:cNvPr id="0" name="youtrack-board.png"/>
+                    <pic:cNvPicPr/>
+                  </pic:nvPicPr>
+                  <pic:blipFill>
+                    <a:blip r:embed="rId10"/>
+                    <a:stretch>
+                      <a:fillRect/>
+                    </a:stretch>
+                  </pic:blipFill>
+                  <pic:spPr>
+                    <a:xfrm>
+                      <a:off x="0" y="0"/>
+                      <a:ext cx="5580000" cy="3487500"/>
+                    </a:xfrm>
+                    <a:prstGeom prst="rect"/>
+                  </pic:spPr>
+                </pic:pic>
+              </a:graphicData>
+            </a:graphic>
+          </wp:inline>
+        </w:drawing>
+      </w:r>
+    </w:p>
+    <w:p>
+      <w:pPr>
+        <w:pStyle w:val="Caption"/>
+      </w:pPr>
+      <w:r>
+        <w:t>Scrum-доска первого спринта в YouTrack</w:t>
+      </w:r>
+    </w:p>
+    <w:p>
       <w:pPr>
         <w:spacing w:after="120"/>
       </w:pPr>
@@ -1989,6 +2077,50 @@
       </w:r>
     </w:p>
     <w:p>
+      <w:r>
+        <w:drawing>
+          <wp:inline xmlns:a="http://schemas.openxmlformats.org/drawingml/2006/main" xmlns:pic="http://schemas.openxmlformats.org/drawingml/2006/picture">
+            <wp:extent cx="5580000" cy="3487500"/>
+            <wp:docPr id="3" name="Picture 3"/>
+            <wp:cNvGraphicFramePr>
+              <a:graphicFrameLocks noChangeAspect="1"/>
+            </wp:cNvGraphicFramePr>
+            <a:graphic>
+              <a:graphicData uri="http://schemas.openxmlformats.org/drawingml/2006/picture">
+                <pic:pic>
+                  <pic:nvPicPr>
+                    <pic:cNvPr id="0" name="youtrack-task.png"/>
+                    <pic:cNvPicPr/>
+                  </pic:nvPicPr>
+                  <pic:blipFill>
+                    <a:blip r:embed="rId11"/>
+                    <a:stretch>
+                      <a:fillRect/>
+                    </a:stretch>
+                  </pic:blipFill>
+                  <pic:spPr>
+                    <a:xfrm>
+                      <a:off x="0" y="0"/>
+                      <a:ext cx="5580000" cy="3487500"/>
+                    </a:xfrm>
+                    <a:prstGeom prst="rect"/>
+                  </pic:spPr>
+                </pic:pic>
+              </a:graphicData>
+            </a:graphic>
+          </wp:inline>
+        </w:drawing>
+      </w:r>
+    </w:p>
+    <w:p>
+      <w:pPr>
+        <w:pStyle w:val="Caption"/>
+      </w:pPr>
+      <w:r>
+        <w:t>Карточка задачи DPRO-21 с описанием, исполнителем, оценкой и спринтом</w:t>
+      </w:r>
+    </w:p>
+    <w:p>
       <w:pPr>
         <w:spacing w:after="120"/>
       </w:pPr>
@@ -2017,7 +2149,7 @@
         <w:spacing w:after="120"/>
       </w:pPr>
       <w:r>
-        <w:t>В разделе Reports созданы встроенные отчёты:</w:t>
+        <w:t>В разделе Reports созданы четыре встроенных отчёта YouTrack. Ниже помещены снимки их страниц на дату среза.</w:t>
       </w:r>
     </w:p>
     <w:tbl>
@@ -2054,7 +2186,7 @@
               <w:rPr>
                 <w:b/>
               </w:rPr>
-              <w:t>ID</w:t>
+              <w:t>Ссылка</w:t>
             </w:r>
           </w:p>
         </w:tc>
@@ -2079,7 +2211,7 @@
           </w:tcPr>
           <w:p>
             <w:r>
-              <w:t>Отчёт по времени</w:t>
+              <w:t>По исполнителям</w:t>
             </w:r>
           </w:p>
         </w:tc>
@@ -2089,7 +2221,39 @@
           </w:tcPr>
           <w:p>
             <w:r>
-              <w:t>227-2</w:t>
+              <w:t>557-0</w:t>
+            </w:r>
+          </w:p>
+        </w:tc>
+        <w:tc>
+          <w:tcPr>
+            <w:tcW w:type="dxa" w:w="3305"/>
+          </w:tcPr>
+          <w:p>
+            <w:r>
+              <w:t>Проект DPRO, только Type: Task</w:t>
+            </w:r>
+          </w:p>
+        </w:tc>
+      </w:tr>
+      <w:tr>
+        <w:tc>
+          <w:tcPr>
+            <w:tcW w:type="dxa" w:w="3305"/>
+          </w:tcPr>
+          <w:p>
+            <w:r>
+              <w:t>По времени</w:t>
+            </w:r>
+          </w:p>
+        </w:tc>
+        <w:tc>
+          <w:tcPr>
+            <w:tcW w:type="dxa" w:w="3305"/>
+          </w:tcPr>
+          <w:p>
+            <w:r>
+              <w:t>227-3</w:t>
             </w:r>
           </w:p>
         </w:tc>
@@ -2121,7 +2285,7 @@
           </w:tcPr>
           <w:p>
             <w:r>
-              <w:t>565-0</w:t>
+              <w:t>565-1</w:t>
             </w:r>
           </w:p>
         </w:tc>
@@ -2131,7 +2295,7 @@
           </w:tcPr>
           <w:p>
             <w:r>
-              <w:t>Проект DPRO, только Type: Task, оценка DPRO Estimation</w:t>
+              <w:t>Проект DPRO, только Type: Task, 02.11.2026–14.06.2027</w:t>
             </w:r>
           </w:p>
         </w:tc>
@@ -2153,7 +2317,7 @@
           </w:tcPr>
           <w:p>
             <w:r>
-              <w:t>430-2</w:t>
+              <w:t>430-3</w:t>
             </w:r>
           </w:p>
         </w:tc>
@@ -2421,15 +2585,15 @@
         <w:spacing w:after="120"/>
       </w:pPr>
       <w:r>
-        <w:t>В срез включены 111 продуктовых задач и две задачи по настройке проекта. Диаграмма построена по данным карточек YouTrack; остальные три отчёта сохранены во встроенном разделе Reports.</w:t>
+        <w:t>В срез включены 111 продуктовых задач и две задачи по настройке проекта.</w:t>
       </w:r>
     </w:p>
     <w:p>
       <w:r>
         <w:drawing>
           <wp:inline xmlns:a="http://schemas.openxmlformats.org/drawingml/2006/main" xmlns:pic="http://schemas.openxmlformats.org/drawingml/2006/picture">
-            <wp:extent cx="5580000" cy="3108857"/>
-            <wp:docPr id="1" name="Picture 1"/>
+            <wp:extent cx="5580000" cy="3487500"/>
+            <wp:docPr id="4" name="Picture 4"/>
             <wp:cNvGraphicFramePr>
               <a:graphicFrameLocks noChangeAspect="1"/>
             </wp:cNvGraphicFramePr>
@@ -2441,7 +2605,7 @@
                     <pic:cNvPicPr/>
                   </pic:nvPicPr>
                   <pic:blipFill>
-                    <a:blip r:embed="rId9"/>
+                    <a:blip r:embed="rId12"/>
                     <a:stretch>
                       <a:fillRect/>
                     </a:stretch>
@@ -2449,7 +2613,7 @@
                   <pic:spPr>
                     <a:xfrm>
                       <a:off x="0" y="0"/>
-                      <a:ext cx="5580000" cy="3108857"/>
+                      <a:ext cx="5580000" cy="3487500"/>
                     </a:xfrm>
                     <a:prstGeom prst="rect"/>
                   </pic:spPr>
@@ -2473,15 +2637,15 @@
         <w:spacing w:after="120"/>
       </w:pPr>
       <w:r>
-        <w:t>В burndown плановая линия снижается от 7 500 ч к нулю к завершению S16. Фактическая линия на дату среза остаётся на начальном уровне: продуктовые задачи не закрывались. Это нормальное состояние до старта первого спринта; график не следует выдавать за результат завершённого проекта.</w:t>
+        <w:t>В burndown идеальная линия снижается от 7 500 ч к нулю к завершению S16. Фактическая динамика пока не сформирована: продуктовые задачи не закрывались. На оси времени YouTrack отображает оценку в рабочих неделях и днях.</w:t>
       </w:r>
     </w:p>
     <w:p>
       <w:r>
         <w:drawing>
           <wp:inline xmlns:a="http://schemas.openxmlformats.org/drawingml/2006/main" xmlns:pic="http://schemas.openxmlformats.org/drawingml/2006/picture">
-            <wp:extent cx="5580000" cy="2790000"/>
-            <wp:docPr id="2" name="Picture 2"/>
+            <wp:extent cx="5580000" cy="3487500"/>
+            <wp:docPr id="5" name="Picture 5"/>
             <wp:cNvGraphicFramePr>
               <a:graphicFrameLocks noChangeAspect="1"/>
             </wp:cNvGraphicFramePr>
@@ -2493,7 +2657,7 @@
                     <pic:cNvPicPr/>
                   </pic:nvPicPr>
                   <pic:blipFill>
-                    <a:blip r:embed="rId10"/>
+                    <a:blip r:embed="rId13"/>
                     <a:stretch>
                       <a:fillRect/>
                     </a:stretch>
@@ -2501,7 +2665,7 @@
                   <pic:spPr>
                     <a:xfrm>
                       <a:off x="0" y="0"/>
-                      <a:ext cx="5580000" cy="2790000"/>
+                      <a:ext cx="5580000" cy="3487500"/>
                     </a:xfrm>
                     <a:prstGeom prst="rect"/>
                   </pic:spPr>
@@ -2525,15 +2689,15 @@
         <w:spacing w:after="120"/>
       </w:pPr>
       <w:r>
-        <w:t>В учёте времени сейчас 0 ч по разработке MVP. Время добавляется по work items после выполнения задач; отсутствие записей не означает нулевую плановую стоимость. Сравнение плана с фактом станет возможным после начала разработки.</w:t>
+        <w:t>В учёте времени сейчас 0 ч по разработке MVP, поэтому встроенный отчёт показывает отсутствие данных. Время добавляется по work items после выполнения задач; сравнение плана с фактом станет возможным после начала разработки.</w:t>
       </w:r>
     </w:p>
     <w:p>
       <w:r>
         <w:drawing>
           <wp:inline xmlns:a="http://schemas.openxmlformats.org/drawingml/2006/main" xmlns:pic="http://schemas.openxmlformats.org/drawingml/2006/picture">
-            <wp:extent cx="5580000" cy="1953000"/>
-            <wp:docPr id="3" name="Picture 3"/>
+            <wp:extent cx="5580000" cy="3487500"/>
+            <wp:docPr id="6" name="Picture 6"/>
             <wp:cNvGraphicFramePr>
               <a:graphicFrameLocks noChangeAspect="1"/>
             </wp:cNvGraphicFramePr>
@@ -2545,7 +2709,7 @@
                     <pic:cNvPicPr/>
                   </pic:nvPicPr>
                   <pic:blipFill>
-                    <a:blip r:embed="rId11"/>
+                    <a:blip r:embed="rId14"/>
                     <a:stretch>
                       <a:fillRect/>
                     </a:stretch>
@@ -2553,7 +2717,7 @@
                   <pic:spPr>
                     <a:xfrm>
                       <a:off x="0" y="0"/>
-                      <a:ext cx="5580000" cy="1953000"/>
+                      <a:ext cx="5580000" cy="3487500"/>
                     </a:xfrm>
                     <a:prstGeom prst="rect"/>
                   </pic:spPr>
@@ -2577,15 +2741,15 @@
         <w:spacing w:after="120"/>
       </w:pPr>
       <w:r>
-        <w:t>Плановая диаграмма Ганта строится по календарю спринтов и датам релизов. Встроенный отчёт YouTrack создан с полем оценки DPRO Estimation. Для достоверного критического пути потребуется указать зависимости между детальными задачами и уточнить оценки после первых спринтов.</w:t>
+        <w:t>Встроенная диаграмма Ганта отображает оценённые задачи. Даты начала в карточках пока не указаны, поэтому YouTrack рассчитывает их от даты создания, а не по календарю 16 спринтов. Календарный план спринтов приведён в разделе 5; для полноценного графика Ганта нужно задать даты начала и зависимости между задачами.</w:t>
       </w:r>
     </w:p>
     <w:p>
       <w:r>
         <w:drawing>
           <wp:inline xmlns:a="http://schemas.openxmlformats.org/drawingml/2006/main" xmlns:pic="http://schemas.openxmlformats.org/drawingml/2006/picture">
-            <wp:extent cx="5580000" cy="3661875"/>
-            <wp:docPr id="4" name="Picture 4"/>
+            <wp:extent cx="5580000" cy="3487500"/>
+            <wp:docPr id="7" name="Picture 7"/>
             <wp:cNvGraphicFramePr>
               <a:graphicFrameLocks noChangeAspect="1"/>
             </wp:cNvGraphicFramePr>
@@ -2597,7 +2761,7 @@
                     <pic:cNvPicPr/>
                   </pic:nvPicPr>
                   <pic:blipFill>
-                    <a:blip r:embed="rId12"/>
+                    <a:blip r:embed="rId15"/>
                     <a:stretch>
                       <a:fillRect/>
                     </a:stretch>
@@ -2605,7 +2769,7 @@
                   <pic:spPr>
                     <a:xfrm>
                       <a:off x="0" y="0"/>
-                      <a:ext cx="5580000" cy="3661875"/>
+                      <a:ext cx="5580000" cy="3487500"/>
                     </a:xfrm>
                     <a:prstGeom prst="rect"/>
                   </pic:spPr>
@@ -2669,7 +2833,7 @@
         <w:spacing w:after="120"/>
       </w:pPr>
       <w:r>
-        <w:t>1. Лабораторная работа № 1 — требования и оценка трудоёмкости.</w:t>
+        <w:t>1. Лабораторная работа № 1 — требования и оценка трудоёмкости (локальный архив курса).</w:t>
       </w:r>
     </w:p>
     <w:p>

</xml_diff>